<commit_message>
Toán 12: chuẩn hoá phông Times New Roman cỡ 12 cho toàn bộ KHBD
Co-Authored-By: Claude Opus 5.5 <noreply@anthropic.com>
</commit_message>
<xml_diff>
--- a/mon/toan/khbd/lop12/KHBD_Bai1_Toan12_DonDieu_CucTri_v3.docx
+++ b/mon/toan/khbd/lop12/KHBD_Bai1_Toan12_DonDieu_CucTri_v3.docx
@@ -98,8 +98,8 @@
           <w:b/>
           <w:bCs/>
           <w:color w:val="FF0000"/>
-          <w:sz w:val="28"/>
-          <w:szCs w:val="28"/>
+          <w:sz w:val="24"/>
+          <w:szCs w:val="24"/>
         </w:rPr>
         <w:t>KẾ HOẠCH BÀI DẠY MÔN TOÁN LỚP 12</w:t>
       </w:r>
@@ -22467,7 +22467,7 @@
       <w:r>
         <w:rPr>
           <w:i/>
-          <w:sz w:val="20"/>
+          <w:sz w:val="24"/>
         </w:rPr>
         <w:t>Sơ đồ tư duy – Tính đơn điệu &amp; Cực trị (TTT biên soạn theo SGK)</w:t>
       </w:r>
@@ -22597,8 +22597,8 @@
                 <w:b/>
                 <w:bCs/>
                 <w:color w:val="1F9E92"/>
-                <w:sz w:val="28"/>
-                <w:szCs w:val="28"/>
+                <w:sz w:val="24"/>
+                <w:szCs w:val="24"/>
               </w:rPr>
               <w:t>BÀI TRẮC NGHIỆM CỦNG CỐ ONLINE – BÀI 1</w:t>
             </w:r>
@@ -32217,8 +32217,8 @@
         <w:iCs/>
         <w:noProof/>
         <w:color w:val="404040"/>
-        <w:sz w:val="22"/>
-        <w:szCs w:val="22"/>
+        <w:sz w:val="24"/>
+        <w:szCs w:val="24"/>
       </w:rPr>
     </w:pPr>
     <w:r>
@@ -32229,8 +32229,8 @@
         <w:iCs/>
         <w:noProof/>
         <w:color w:val="404040"/>
-        <w:sz w:val="22"/>
-        <w:szCs w:val="22"/>
+        <w:sz w:val="24"/>
+        <w:szCs w:val="24"/>
       </w:rPr>
       <w:t xml:space="preserve">GV: TTT                                                                                                                                 Trang </w:t>
     </w:r>
@@ -32242,8 +32242,8 @@
         <w:iCs/>
         <w:noProof/>
         <w:color w:val="404040"/>
-        <w:sz w:val="22"/>
-        <w:szCs w:val="22"/>
+        <w:sz w:val="24"/>
+        <w:szCs w:val="24"/>
       </w:rPr>
       <w:fldChar w:fldCharType="begin"/>
     </w:r>
@@ -32255,8 +32255,8 @@
         <w:iCs/>
         <w:noProof/>
         <w:color w:val="404040"/>
-        <w:sz w:val="22"/>
-        <w:szCs w:val="22"/>
+        <w:sz w:val="24"/>
+        <w:szCs w:val="24"/>
       </w:rPr>
       <w:instrText xml:space="preserve"> PAGE   \* MERGEFORMAT </w:instrText>
     </w:r>
@@ -32268,8 +32268,8 @@
         <w:iCs/>
         <w:noProof/>
         <w:color w:val="404040"/>
-        <w:sz w:val="22"/>
-        <w:szCs w:val="22"/>
+        <w:sz w:val="24"/>
+        <w:szCs w:val="24"/>
       </w:rPr>
       <w:fldChar w:fldCharType="separate"/>
     </w:r>
@@ -32281,8 +32281,8 @@
         <w:iCs/>
         <w:noProof/>
         <w:color w:val="404040"/>
-        <w:sz w:val="22"/>
-        <w:szCs w:val="22"/>
+        <w:sz w:val="24"/>
+        <w:szCs w:val="24"/>
       </w:rPr>
       <w:t>2</w:t>
     </w:r>
@@ -32294,8 +32294,8 @@
         <w:iCs/>
         <w:noProof/>
         <w:color w:val="404040"/>
-        <w:sz w:val="22"/>
-        <w:szCs w:val="22"/>
+        <w:sz w:val="24"/>
+        <w:szCs w:val="24"/>
       </w:rPr>
       <w:fldChar w:fldCharType="end"/>
     </w:r>
@@ -32305,8 +32305,8 @@
       <w:rPr>
         <w:i/>
         <w:iCs/>
-        <w:sz w:val="22"/>
-        <w:szCs w:val="22"/>
+        <w:sz w:val="24"/>
+        <w:szCs w:val="24"/>
       </w:rPr>
     </w:pPr>
   </w:p>
@@ -32362,8 +32362,8 @@
         <w:i/>
         <w:iCs/>
         <w:color w:val="404040"/>
-        <w:sz w:val="22"/>
-        <w:szCs w:val="22"/>
+        <w:sz w:val="24"/>
+        <w:szCs w:val="24"/>
       </w:rPr>
       <w:t>KHBD-TOÁN12                                                                                                                 Năm học 2026-2027</w:t>
     </w:r>
@@ -32375,8 +32375,8 @@
           <w:i/>
           <w:iCs/>
           <w:color w:val="404040"/>
-          <w:sz w:val="22"/>
-          <w:szCs w:val="22"/>
+          <w:sz w:val="24"/>
+          <w:szCs w:val="24"/>
         </w:rPr>
         <w:alias w:val="Title"/>
         <w:tag w:val=""/>
@@ -32392,8 +32392,8 @@
           <w:i w:val="0"/>
           <w:iCs w:val="0"/>
           <w:color w:val="auto"/>
-          <w:sz w:val="27"/>
-          <w:szCs w:val="27"/>
+          <w:sz w:val="24"/>
+          <w:szCs w:val="24"/>
         </w:rPr>
       </w:sdtEndPr>
       <w:sdtContent>
@@ -32404,8 +32404,8 @@
             <w:i/>
             <w:iCs/>
             <w:color w:val="404040"/>
-            <w:sz w:val="22"/>
-            <w:szCs w:val="22"/>
+            <w:sz w:val="24"/>
+            <w:szCs w:val="24"/>
           </w:rPr>
           <w:t xml:space="preserve">     </w:t>
         </w:r>
@@ -32716,10 +32716,10 @@
   <w:docDefaults>
     <w:rPrDefault>
       <w:rPr>
-        <w:rFonts w:ascii="Times New Roman" w:eastAsia="Times New Roman" w:hAnsi="Times New Roman" w:cs="Times New Roman"/>
-        <w:sz w:val="26"/>
-        <w:szCs w:val="26"/>
+        <w:rFonts w:ascii="Times New Roman" w:hAnsi="Times New Roman" w:eastAsia="Times New Roman" w:cs="Times New Roman"/>
         <w:lang w:val="en-GB" w:eastAsia="en-GB" w:bidi="ar-SA"/>
+        <w:sz w:val="24"/>
+        <w:szCs w:val="24"/>
       </w:rPr>
     </w:rPrDefault>
     <w:pPrDefault/>
@@ -33115,8 +33115,8 @@
     </w:pPr>
     <w:rPr>
       <w:color w:val="2E74B5"/>
-      <w:sz w:val="32"/>
-      <w:szCs w:val="32"/>
+      <w:sz w:val="24"/>
+      <w:szCs w:val="24"/>
     </w:rPr>
   </w:style>
   <w:style w:type="paragraph" w:styleId="Heading2">
@@ -33220,8 +33220,8 @@
     <w:uiPriority w:val="10"/>
     <w:qFormat/>
     <w:rPr>
-      <w:sz w:val="56"/>
-      <w:szCs w:val="56"/>
+      <w:sz w:val="24"/>
+      <w:szCs w:val="24"/>
     </w:rPr>
   </w:style>
   <w:style w:type="paragraph" w:customStyle="1" w:styleId="Strong1">
@@ -33261,8 +33261,8 @@
     <w:semiHidden/>
     <w:unhideWhenUsed/>
     <w:rPr>
-      <w:sz w:val="20"/>
-      <w:szCs w:val="20"/>
+      <w:sz w:val="24"/>
+      <w:szCs w:val="24"/>
     </w:rPr>
   </w:style>
   <w:style w:type="character" w:customStyle="1" w:styleId="FootnoteTextChar">
@@ -33272,8 +33272,8 @@
     <w:semiHidden/>
     <w:unhideWhenUsed/>
     <w:rPr>
-      <w:sz w:val="20"/>
-      <w:szCs w:val="20"/>
+      <w:sz w:val="24"/>
+      <w:szCs w:val="24"/>
     </w:rPr>
   </w:style>
   <w:style w:type="character" w:styleId="EndnoteReference">
@@ -33292,8 +33292,8 @@
     <w:semiHidden/>
     <w:unhideWhenUsed/>
     <w:rPr>
-      <w:sz w:val="20"/>
-      <w:szCs w:val="20"/>
+      <w:sz w:val="24"/>
+      <w:szCs w:val="24"/>
     </w:rPr>
   </w:style>
   <w:style w:type="character" w:customStyle="1" w:styleId="EndnoteTextChar">
@@ -33303,8 +33303,8 @@
     <w:semiHidden/>
     <w:unhideWhenUsed/>
     <w:rPr>
-      <w:sz w:val="20"/>
-      <w:szCs w:val="20"/>
+      <w:sz w:val="24"/>
+      <w:szCs w:val="24"/>
     </w:rPr>
   </w:style>
 </w:styles>

</xml_diff>